<commit_message>
docs(gns3): regenera DOCX de decisiones + build_docx parametrizable
- build_docx.py ahora acepta el .md como argumento (retrocompatible
  con MANUAL_DEMOSTRACION.md por defecto)
- GNS3_MIGRATION_DECISIONS.docx regenerado con §11 (decisiones de
  ejecucion 2026-05-30) y fix open relay bt-mail

Co-Authored-By: Claude Opus 4.8 <noreply@anthropic.com>
</commit_message>
<xml_diff>
--- a/reports/GNS3_MIGRATION_DECISIONS.docx
+++ b/reports/GNS3_MIGRATION_DECISIONS.docx
@@ -1290,7 +1290,27 @@
                 <w:color w:val="C00000"/>
                 <w:sz w:val="19"/>
               </w:rPr>
+              <w:t>redteam/client:latest</w:t>
+            </w:r>
+            <w:r>
+              <w:rPr>
+                <w:sz w:val="19"/>
+              </w:rPr>
+              <w:t xml:space="preserve"> (GNS3) / </w:t>
+            </w:r>
+            <w:r>
+              <w:rPr>
+                <w:rFonts w:ascii="Courier New" w:hAnsi="Courier New"/>
+                <w:color w:val="C00000"/>
+                <w:sz w:val="19"/>
+              </w:rPr>
               <w:t>ubuntu:22.04</w:t>
+            </w:r>
+            <w:r>
+              <w:rPr>
+                <w:sz w:val="19"/>
+              </w:rPr>
+              <w:t xml:space="preserve"> (Compose)</w:t>
             </w:r>
           </w:p>
         </w:tc>
@@ -1308,7 +1328,7 @@
               <w:rPr>
                 <w:sz w:val="19"/>
               </w:rPr>
-              <w:t>Cliente pasivo</w:t>
+              <w:t>Cliente pasivo — ver §11.4</w:t>
             </w:r>
           </w:p>
         </w:tc>
@@ -1369,7 +1389,27 @@
                 <w:color w:val="C00000"/>
                 <w:sz w:val="19"/>
               </w:rPr>
+              <w:t>redteam/client:latest</w:t>
+            </w:r>
+            <w:r>
+              <w:rPr>
+                <w:sz w:val="19"/>
+              </w:rPr>
+              <w:t xml:space="preserve"> (GNS3) / </w:t>
+            </w:r>
+            <w:r>
+              <w:rPr>
+                <w:rFonts w:ascii="Courier New" w:hAnsi="Courier New"/>
+                <w:color w:val="C00000"/>
+                <w:sz w:val="19"/>
+              </w:rPr>
               <w:t>ubuntu:22.04</w:t>
+            </w:r>
+            <w:r>
+              <w:rPr>
+                <w:sz w:val="19"/>
+              </w:rPr>
+              <w:t xml:space="preserve"> (Compose)</w:t>
             </w:r>
           </w:p>
         </w:tc>
@@ -1388,7 +1428,7 @@
               <w:rPr>
                 <w:sz w:val="19"/>
               </w:rPr>
-              <w:t>Cliente pasivo</w:t>
+              <w:t>Cliente pasivo — ver §11.4</w:t>
             </w:r>
           </w:p>
         </w:tc>
@@ -3826,7 +3866,7 @@
                 <w:color w:val="C00000"/>
                 <w:sz w:val="19"/>
               </w:rPr>
-              <w:t>smtpd_recipient_restrictions = permit_all</w:t>
+              <w:t>smtpd_relay_restrictions = permit_mynetworks, reject_unauth_destination</w:t>
             </w:r>
           </w:p>
         </w:tc>
@@ -3845,7 +3885,7 @@
               <w:rPr>
                 <w:sz w:val="19"/>
               </w:rPr>
-              <w:t>Sin restricción</w:t>
+              <w:t>Open relay efectivo</w:t>
             </w:r>
           </w:p>
         </w:tc>
@@ -3862,9 +3902,31 @@
             </w:r>
             <w:r>
               <w:rPr>
-                <w:sz w:val="19"/>
-              </w:rPr>
-              <w:t>Acepta cualquier destinatario</w:t>
+                <w:rFonts w:ascii="Courier New" w:hAnsi="Courier New"/>
+                <w:color w:val="C00000"/>
+                <w:sz w:val="19"/>
+              </w:rPr>
+              <w:t>permit_mynetworks</w:t>
+            </w:r>
+            <w:r>
+              <w:rPr>
+                <w:sz w:val="19"/>
+              </w:rPr>
+              <w:t xml:space="preserve"> con mynetworks=0.0.0.0/0 permite a todos; el </w:t>
+            </w:r>
+            <w:r>
+              <w:rPr>
+                <w:rFonts w:ascii="Courier New" w:hAnsi="Courier New"/>
+                <w:color w:val="C00000"/>
+                <w:sz w:val="19"/>
+              </w:rPr>
+              <w:t>reject</w:t>
+            </w:r>
+            <w:r>
+              <w:rPr>
+                <w:sz w:val="19"/>
+              </w:rPr>
+              <w:t xml:space="preserve"> nunca se alcanza</w:t>
             </w:r>
           </w:p>
         </w:tc>
@@ -4088,6 +4150,21 @@
           <w:sz w:val="21"/>
         </w:rPr>
         <w:t>.</w:t>
+      </w:r>
+    </w:p>
+    <w:p>
+      <w:pPr>
+        <w:spacing w:before="40" w:after="40"/>
+        <w:ind w:left="567" w:right="567"/>
+        <w:shd w:val="clear" w:color="auto" w:fill="FFF3CD"/>
+      </w:pPr>
+      <w:r>
+        <w:rPr>
+          <w:b/>
+          <w:color w:val="856604"/>
+          <w:sz w:val="20"/>
+        </w:rPr>
+        <w:t>⚠ **Corrección 2026-05-29:** la versión inicial del `main.cf` usaba `smtpd_recipient_restrictions = permit_all`. `permit_all` **NO es una restricción válida de Postfix**, y además Postfix 3.6 aborta el arranque de `smtpd` ("bad command startup -- throttling") si no hay al menos un `reject_*` terminal. El resultado: `master` escuchaba en :25 pero cada `smtpd` moría al instante (sin banner SMTP). La corrección usa `permit_mynetworks, reject_unauth_destination` — como `mynetworks = 0.0.0.0/0`, `permit_mynetworks` ya permite a cualquier cliente (open relay intacto) y el `reject` solo satisface el chequeo de seguridad de Postfix sin llegar a ejecutarse. Verificado: banner `220 bt-mail.lab.local ESMTP Postfix`.</w:t>
       </w:r>
     </w:p>
     <w:p>
@@ -7397,6 +7474,1865 @@
           <w:sz w:val="21"/>
         </w:rPr>
         <w:t>.</w:t>
+      </w:r>
+    </w:p>
+    <w:p>
+      <w:pPr>
+        <w:pBdr>
+          <w:bottom w:val="single" w:sz="6" w:space="1" w:color="1F3564"/>
+        </w:pBdr>
+        <w:spacing w:after="80"/>
+      </w:pPr>
+    </w:p>
+    <w:p>
+      <w:pPr>
+        <w:pStyle w:val="Heading1"/>
+        <w:spacing w:before="280" w:after="80"/>
+      </w:pPr>
+      <w:r>
+        <w:rPr>
+          <w:rFonts w:ascii="Calibri" w:hAnsi="Calibri"/>
+          <w:b/>
+          <w:color w:val="1F3564"/>
+          <w:sz w:val="28"/>
+        </w:rPr>
+        <w:t>11. Decisiones de Ejecución (2026-05-29)</w:t>
+      </w:r>
+    </w:p>
+    <w:p>
+      <w:pPr>
+        <w:pBdr>
+          <w:bottom w:val="single" w:sz="6" w:space="1" w:color="1F3564"/>
+        </w:pBdr>
+        <w:spacing w:after="80"/>
+      </w:pPr>
+    </w:p>
+    <w:p>
+      <w:pPr>
+        <w:spacing w:before="40" w:after="80"/>
+      </w:pPr>
+      <w:r>
+        <w:rPr>
+          <w:sz w:val="21"/>
+        </w:rPr>
+        <w:t xml:space="preserve">Esta sección documenta las decisiones tomadas al </w:t>
+      </w:r>
+      <w:r>
+        <w:rPr>
+          <w:b/>
+          <w:sz w:val="21"/>
+        </w:rPr>
+        <w:t>construir y verificar realmente</w:t>
+      </w:r>
+      <w:r>
+        <w:rPr>
+          <w:sz w:val="21"/>
+        </w:rPr>
+        <w:t xml:space="preserve"> la topología, que difieren o amplían el plan teórico de las secciones anteriores. La topología quedó </w:t>
+      </w:r>
+      <w:r>
+        <w:rPr>
+          <w:b/>
+          <w:sz w:val="21"/>
+        </w:rPr>
+        <w:t>funcional end-to-end</w:t>
+      </w:r>
+      <w:r>
+        <w:rPr>
+          <w:sz w:val="21"/>
+        </w:rPr>
+        <w:t xml:space="preserve"> con los 8 nodos operativos.</w:t>
+      </w:r>
+    </w:p>
+    <w:p>
+      <w:pPr>
+        <w:pStyle w:val="Heading2"/>
+        <w:spacing w:before="200" w:after="40"/>
+      </w:pPr>
+      <w:r>
+        <w:rPr>
+          <w:rFonts w:ascii="Calibri" w:hAnsi="Calibri"/>
+          <w:b/>
+          <w:color w:val="1F3564"/>
+          <w:sz w:val="24"/>
+        </w:rPr>
+        <w:t>11.1 Build dentro de la GNS3 VM en vez de transferir el `.tar`</w:t>
+      </w:r>
+    </w:p>
+    <w:p>
+      <w:pPr>
+        <w:spacing w:before="40" w:after="80"/>
+      </w:pPr>
+      <w:r>
+        <w:rPr>
+          <w:b/>
+          <w:sz w:val="21"/>
+        </w:rPr>
+        <w:t>Plan original (sección §10, paso 4):</w:t>
+      </w:r>
+      <w:r>
+        <w:rPr>
+          <w:sz w:val="21"/>
+        </w:rPr>
+        <w:t xml:space="preserve"> construir las imágenes en Windows, exportarlas con </w:t>
+      </w:r>
+      <w:r>
+        <w:rPr>
+          <w:rFonts w:ascii="Courier New" w:hAnsi="Courier New"/>
+          <w:color w:val="C00000"/>
+          <w:sz w:val="21"/>
+        </w:rPr>
+        <w:t>docker save</w:t>
+      </w:r>
+      <w:r>
+        <w:rPr>
+          <w:sz w:val="21"/>
+        </w:rPr>
+        <w:t xml:space="preserve"> y transferirlas con </w:t>
+      </w:r>
+      <w:r>
+        <w:rPr>
+          <w:rFonts w:ascii="Courier New" w:hAnsi="Courier New"/>
+          <w:color w:val="C00000"/>
+          <w:sz w:val="21"/>
+        </w:rPr>
+        <w:t>scp</w:t>
+      </w:r>
+      <w:r>
+        <w:rPr>
+          <w:sz w:val="21"/>
+        </w:rPr>
+        <w:t>.</w:t>
+      </w:r>
+    </w:p>
+    <w:p>
+      <w:pPr>
+        <w:spacing w:before="40" w:after="80"/>
+      </w:pPr>
+      <w:r>
+        <w:rPr>
+          <w:b/>
+          <w:sz w:val="21"/>
+        </w:rPr>
+        <w:t>Problema encontrado:</w:t>
+      </w:r>
+      <w:r>
+        <w:rPr>
+          <w:sz w:val="21"/>
+        </w:rPr>
+        <w:t xml:space="preserve"> la imagen </w:t>
+      </w:r>
+      <w:r>
+        <w:rPr>
+          <w:rFonts w:ascii="Courier New" w:hAnsi="Courier New"/>
+          <w:color w:val="C00000"/>
+          <w:sz w:val="21"/>
+        </w:rPr>
+        <w:t>redteam/kali</w:t>
+      </w:r>
+      <w:r>
+        <w:rPr>
+          <w:sz w:val="21"/>
+        </w:rPr>
+        <w:t xml:space="preserve"> pesa </w:t>
+      </w:r>
+      <w:r>
+        <w:rPr>
+          <w:b/>
+          <w:sz w:val="21"/>
+        </w:rPr>
+        <w:t>1064 MB</w:t>
+      </w:r>
+      <w:r>
+        <w:rPr>
+          <w:sz w:val="21"/>
+        </w:rPr>
+        <w:t>. La transferencia SCP iba a ~300 kB/s (&gt;50 minutos estimados) por el rendimiento de la red SSH hacia la VM.</w:t>
+      </w:r>
+    </w:p>
+    <w:p>
+      <w:pPr>
+        <w:spacing w:before="40" w:after="80"/>
+      </w:pPr>
+      <w:r>
+        <w:rPr>
+          <w:b/>
+          <w:sz w:val="21"/>
+        </w:rPr>
+        <w:t>Decisión:</w:t>
+      </w:r>
+      <w:r>
+        <w:rPr>
+          <w:sz w:val="21"/>
+        </w:rPr>
+        <w:t xml:space="preserve"> transferir solo el </w:t>
+      </w:r>
+      <w:r>
+        <w:rPr>
+          <w:b/>
+          <w:sz w:val="21"/>
+        </w:rPr>
+        <w:t>código fuente</w:t>
+      </w:r>
+      <w:r>
+        <w:rPr>
+          <w:sz w:val="21"/>
+        </w:rPr>
+        <w:t xml:space="preserve"> (</w:t>
+      </w:r>
+      <w:r>
+        <w:rPr>
+          <w:rFonts w:ascii="Courier New" w:hAnsi="Courier New"/>
+          <w:color w:val="C00000"/>
+          <w:sz w:val="21"/>
+        </w:rPr>
+        <w:t>docker/</w:t>
+      </w:r>
+      <w:r>
+        <w:rPr>
+          <w:sz w:val="21"/>
+        </w:rPr>
+        <w:t xml:space="preserve">, </w:t>
+      </w:r>
+      <w:r>
+        <w:rPr>
+          <w:rFonts w:ascii="Courier New" w:hAnsi="Courier New"/>
+          <w:color w:val="C00000"/>
+          <w:sz w:val="21"/>
+        </w:rPr>
+        <w:t>scripts/</w:t>
+      </w:r>
+      <w:r>
+        <w:rPr>
+          <w:sz w:val="21"/>
+        </w:rPr>
+        <w:t xml:space="preserve">, </w:t>
+      </w:r>
+      <w:r>
+        <w:rPr>
+          <w:rFonts w:ascii="Courier New" w:hAnsi="Courier New"/>
+          <w:color w:val="C00000"/>
+          <w:sz w:val="21"/>
+        </w:rPr>
+        <w:t>playbooks/</w:t>
+      </w:r>
+      <w:r>
+        <w:rPr>
+          <w:sz w:val="21"/>
+        </w:rPr>
+        <w:t xml:space="preserve"> — pocos KB) y ejecutar </w:t>
+      </w:r>
+      <w:r>
+        <w:rPr>
+          <w:rFonts w:ascii="Courier New" w:hAnsi="Courier New"/>
+          <w:color w:val="C00000"/>
+          <w:sz w:val="21"/>
+        </w:rPr>
+        <w:t>docker build</w:t>
+      </w:r>
+      <w:r>
+        <w:rPr>
+          <w:sz w:val="21"/>
+        </w:rPr>
+        <w:t xml:space="preserve"> </w:t>
+      </w:r>
+      <w:r>
+        <w:rPr>
+          <w:b/>
+          <w:sz w:val="21"/>
+        </w:rPr>
+        <w:t>dentro de la GNS3 VM</w:t>
+      </w:r>
+      <w:r>
+        <w:rPr>
+          <w:sz w:val="21"/>
+        </w:rPr>
+        <w:t>, que tiene acceso a internet por el adaptador NAT. La VM descarga las imágenes base (kali-rolling, ubuntu) directamente desde Docker Hub a velocidad de banda ancha.</w:t>
+      </w:r>
+    </w:p>
+    <w:p>
+      <w:pPr>
+        <w:spacing w:before="40" w:after="80"/>
+      </w:pPr>
+      <w:r>
+        <w:rPr>
+          <w:b/>
+          <w:sz w:val="21"/>
+        </w:rPr>
+        <w:t>Implicación operativa:</w:t>
+      </w:r>
+      <w:r>
+        <w:rPr>
+          <w:sz w:val="21"/>
+        </w:rPr>
+        <w:t xml:space="preserve"> al modificar un script o Dockerfile, se re-transfiere solo el archivo cambiado con </w:t>
+      </w:r>
+      <w:r>
+        <w:rPr>
+          <w:rFonts w:ascii="Courier New" w:hAnsi="Courier New"/>
+          <w:color w:val="C00000"/>
+          <w:sz w:val="21"/>
+        </w:rPr>
+        <w:t>pscp</w:t>
+      </w:r>
+      <w:r>
+        <w:rPr>
+          <w:sz w:val="21"/>
+        </w:rPr>
+        <w:t xml:space="preserve"> y se reconstruye la imagen en la VM. No se usa </w:t>
+      </w:r>
+      <w:r>
+        <w:rPr>
+          <w:rFonts w:ascii="Courier New" w:hAnsi="Courier New"/>
+          <w:color w:val="C00000"/>
+          <w:sz w:val="21"/>
+        </w:rPr>
+        <w:t>docker save</w:t>
+      </w:r>
+      <w:r>
+        <w:rPr>
+          <w:sz w:val="21"/>
+        </w:rPr>
+        <w:t>/</w:t>
+      </w:r>
+      <w:r>
+        <w:rPr>
+          <w:rFonts w:ascii="Courier New" w:hAnsi="Courier New"/>
+          <w:color w:val="C00000"/>
+          <w:sz w:val="21"/>
+        </w:rPr>
+        <w:t>load</w:t>
+      </w:r>
+      <w:r>
+        <w:rPr>
+          <w:sz w:val="21"/>
+        </w:rPr>
+        <w:t>.</w:t>
+      </w:r>
+    </w:p>
+    <w:p>
+      <w:pPr>
+        <w:pStyle w:val="Heading2"/>
+        <w:spacing w:before="200" w:after="40"/>
+      </w:pPr>
+      <w:r>
+        <w:rPr>
+          <w:rFonts w:ascii="Calibri" w:hAnsi="Calibri"/>
+          <w:b/>
+          <w:color w:val="1F3564"/>
+          <w:sz w:val="24"/>
+        </w:rPr>
+        <w:t>11.2 GNS3 reutiliza el contenedor en stop/start</w:t>
+      </w:r>
+    </w:p>
+    <w:p>
+      <w:pPr>
+        <w:spacing w:before="40" w:after="80"/>
+      </w:pPr>
+      <w:r>
+        <w:rPr>
+          <w:b/>
+          <w:sz w:val="21"/>
+        </w:rPr>
+        <w:t>Hallazgo crítico:</w:t>
+      </w:r>
+      <w:r>
+        <w:rPr>
+          <w:sz w:val="21"/>
+        </w:rPr>
+        <w:t xml:space="preserve"> al cambiar la configuración de un nodo Docker en GNS3 (imagen, variables de entorno, </w:t>
+      </w:r>
+      <w:r>
+        <w:rPr>
+          <w:rFonts w:ascii="Courier New" w:hAnsi="Courier New"/>
+          <w:color w:val="C00000"/>
+          <w:sz w:val="21"/>
+        </w:rPr>
+        <w:t>start_command</w:t>
+      </w:r>
+      <w:r>
+        <w:rPr>
+          <w:sz w:val="21"/>
+        </w:rPr>
+        <w:t xml:space="preserve">) y reiniciarlo con stop→start, </w:t>
+      </w:r>
+      <w:r>
+        <w:rPr>
+          <w:b/>
+          <w:sz w:val="21"/>
+        </w:rPr>
+        <w:t>GNS3 reutiliza el contenedor existente y NO aplica los cambios</w:t>
+      </w:r>
+      <w:r>
+        <w:rPr>
+          <w:sz w:val="21"/>
+        </w:rPr>
+        <w:t>.</w:t>
+      </w:r>
+    </w:p>
+    <w:p>
+      <w:pPr>
+        <w:spacing w:before="40" w:after="80"/>
+      </w:pPr>
+      <w:r>
+        <w:rPr>
+          <w:b/>
+          <w:sz w:val="21"/>
+        </w:rPr>
+        <w:t>Decisión:</w:t>
+      </w:r>
+      <w:r>
+        <w:rPr>
+          <w:sz w:val="21"/>
+        </w:rPr>
+        <w:t xml:space="preserve"> para aplicar cualquier cambio de configuración hay que </w:t>
+      </w:r>
+      <w:r>
+        <w:rPr>
+          <w:b/>
+          <w:sz w:val="21"/>
+        </w:rPr>
+        <w:t>borrar el nodo y recrearlo</w:t>
+      </w:r>
+      <w:r>
+        <w:rPr>
+          <w:sz w:val="21"/>
+        </w:rPr>
+        <w:t xml:space="preserve"> desde el template (vía API REST o GUI). Esto se automatizó en los scripts de despliegue.</w:t>
+      </w:r>
+    </w:p>
+    <w:p>
+      <w:pPr>
+        <w:pStyle w:val="Heading2"/>
+        <w:spacing w:before="200" w:after="40"/>
+      </w:pPr>
+      <w:r>
+        <w:rPr>
+          <w:rFonts w:ascii="Calibri" w:hAnsi="Calibri"/>
+          <w:b/>
+          <w:color w:val="1F3564"/>
+          <w:sz w:val="24"/>
+        </w:rPr>
+        <w:t>11.3 Asignación de IP: tres mecanismos según la imagen</w:t>
+      </w:r>
+    </w:p>
+    <w:p>
+      <w:pPr>
+        <w:spacing w:before="40" w:after="80"/>
+      </w:pPr>
+      <w:r>
+        <w:rPr>
+          <w:sz w:val="21"/>
+        </w:rPr>
+        <w:t xml:space="preserve">El entrypoint que lee </w:t>
+      </w:r>
+      <w:r>
+        <w:rPr>
+          <w:rFonts w:ascii="Courier New" w:hAnsi="Courier New"/>
+          <w:color w:val="C00000"/>
+          <w:sz w:val="21"/>
+        </w:rPr>
+        <w:t>CONTAINER_IP</w:t>
+      </w:r>
+      <w:r>
+        <w:rPr>
+          <w:sz w:val="21"/>
+        </w:rPr>
+        <w:t xml:space="preserve"> (sección §5) solo funciona en imágenes </w:t>
+      </w:r>
+      <w:r>
+        <w:rPr>
+          <w:b/>
+          <w:sz w:val="21"/>
+        </w:rPr>
+        <w:t>propias</w:t>
+      </w:r>
+      <w:r>
+        <w:rPr>
+          <w:sz w:val="21"/>
+        </w:rPr>
+        <w:t>. Las imágenes de terceros no lo tienen:</w:t>
+      </w:r>
+    </w:p>
+    <w:tbl>
+      <w:tblPr>
+        <w:tblStyle w:val="TableGrid"/>
+        <w:tblW w:type="auto" w:w="0"/>
+        <w:jc w:val="left"/>
+        <w:tblLook w:firstColumn="1" w:firstRow="1" w:lastColumn="0" w:lastRow="0" w:noHBand="0" w:noVBand="1" w:val="04A0"/>
+      </w:tblPr>
+      <w:tblGrid>
+        <w:gridCol w:w="3135"/>
+        <w:gridCol w:w="3135"/>
+        <w:gridCol w:w="3135"/>
+      </w:tblGrid>
+      <w:tr>
+        <w:tc>
+          <w:tcPr>
+            <w:tcW w:type="dxa" w:w="3135"/>
+            <w:shd w:val="clear" w:color="auto" w:fill="1F3564"/>
+          </w:tcPr>
+          <w:p>
+            <w:r>
+              <w:rPr>
+                <w:b/>
+                <w:color w:val="FFFFFF"/>
+                <w:sz w:val="19"/>
+              </w:rPr>
+            </w:r>
+            <w:r>
+              <w:rPr>
+                <w:b/>
+                <w:color w:val="FFFFFF"/>
+                <w:sz w:val="19"/>
+              </w:rPr>
+              <w:t>Imagen</w:t>
+            </w:r>
+          </w:p>
+        </w:tc>
+        <w:tc>
+          <w:tcPr>
+            <w:tcW w:type="dxa" w:w="3135"/>
+            <w:shd w:val="clear" w:color="auto" w:fill="1F3564"/>
+          </w:tcPr>
+          <w:p>
+            <w:r>
+              <w:rPr>
+                <w:b/>
+                <w:color w:val="FFFFFF"/>
+                <w:sz w:val="19"/>
+              </w:rPr>
+            </w:r>
+            <w:r>
+              <w:rPr>
+                <w:b/>
+                <w:color w:val="FFFFFF"/>
+                <w:sz w:val="19"/>
+              </w:rPr>
+              <w:t>Mecanismo de IP</w:t>
+            </w:r>
+          </w:p>
+        </w:tc>
+        <w:tc>
+          <w:tcPr>
+            <w:tcW w:type="dxa" w:w="3135"/>
+            <w:shd w:val="clear" w:color="auto" w:fill="1F3564"/>
+          </w:tcPr>
+          <w:p>
+            <w:r>
+              <w:rPr>
+                <w:b/>
+                <w:color w:val="FFFFFF"/>
+                <w:sz w:val="19"/>
+              </w:rPr>
+            </w:r>
+            <w:r>
+              <w:rPr>
+                <w:b/>
+                <w:color w:val="FFFFFF"/>
+                <w:sz w:val="19"/>
+              </w:rPr>
+              <w:t>Razón</w:t>
+            </w:r>
+          </w:p>
+        </w:tc>
+      </w:tr>
+      <w:tr>
+        <w:tc>
+          <w:tcPr>
+            <w:tcW w:type="dxa" w:w="3135"/>
+          </w:tcPr>
+          <w:p>
+            <w:r>
+              <w:rPr>
+                <w:sz w:val="19"/>
+              </w:rPr>
+            </w:r>
+            <w:r>
+              <w:rPr>
+                <w:rFonts w:ascii="Courier New" w:hAnsi="Courier New"/>
+                <w:color w:val="C00000"/>
+                <w:sz w:val="19"/>
+              </w:rPr>
+              <w:t>redteam/kali</w:t>
+            </w:r>
+            <w:r>
+              <w:rPr>
+                <w:sz w:val="19"/>
+              </w:rPr>
+              <w:t xml:space="preserve">, </w:t>
+            </w:r>
+            <w:r>
+              <w:rPr>
+                <w:rFonts w:ascii="Courier New" w:hAnsi="Courier New"/>
+                <w:color w:val="C00000"/>
+                <w:sz w:val="19"/>
+              </w:rPr>
+              <w:t>blueteam/bt-*</w:t>
+            </w:r>
+          </w:p>
+        </w:tc>
+        <w:tc>
+          <w:tcPr>
+            <w:tcW w:type="dxa" w:w="3135"/>
+          </w:tcPr>
+          <w:p>
+            <w:r>
+              <w:rPr>
+                <w:sz w:val="19"/>
+              </w:rPr>
+            </w:r>
+            <w:r>
+              <w:rPr>
+                <w:sz w:val="19"/>
+              </w:rPr>
+              <w:t xml:space="preserve">Entrypoint </w:t>
+            </w:r>
+            <w:r>
+              <w:rPr>
+                <w:rFonts w:ascii="Courier New" w:hAnsi="Courier New"/>
+                <w:color w:val="C00000"/>
+                <w:sz w:val="19"/>
+              </w:rPr>
+              <w:t>CONTAINER_IP</w:t>
+            </w:r>
+            <w:r>
+              <w:rPr>
+                <w:sz w:val="19"/>
+              </w:rPr>
+              <w:t xml:space="preserve"> (propio)</w:t>
+            </w:r>
+          </w:p>
+        </w:tc>
+        <w:tc>
+          <w:tcPr>
+            <w:tcW w:type="dxa" w:w="3135"/>
+          </w:tcPr>
+          <w:p>
+            <w:r>
+              <w:rPr>
+                <w:sz w:val="19"/>
+              </w:rPr>
+            </w:r>
+            <w:r>
+              <w:rPr>
+                <w:sz w:val="19"/>
+              </w:rPr>
+              <w:t>Dockerfiles propios con el entrypoint</w:t>
+            </w:r>
+          </w:p>
+        </w:tc>
+      </w:tr>
+      <w:tr>
+        <w:tc>
+          <w:tcPr>
+            <w:tcW w:type="dxa" w:w="3135"/>
+            <w:shd w:val="clear" w:color="auto" w:fill="E9EFF8"/>
+          </w:tcPr>
+          <w:p>
+            <w:r>
+              <w:rPr>
+                <w:sz w:val="19"/>
+              </w:rPr>
+            </w:r>
+            <w:r>
+              <w:rPr>
+                <w:rFonts w:ascii="Courier New" w:hAnsi="Courier New"/>
+                <w:color w:val="C00000"/>
+                <w:sz w:val="19"/>
+              </w:rPr>
+              <w:t>tleemcjr/metasploitable2</w:t>
+            </w:r>
+          </w:p>
+        </w:tc>
+        <w:tc>
+          <w:tcPr>
+            <w:tcW w:type="dxa" w:w="3135"/>
+            <w:shd w:val="clear" w:color="auto" w:fill="E9EFF8"/>
+          </w:tcPr>
+          <w:p>
+            <w:r>
+              <w:rPr>
+                <w:sz w:val="19"/>
+              </w:rPr>
+            </w:r>
+            <w:r>
+              <w:rPr>
+                <w:rFonts w:ascii="Courier New" w:hAnsi="Courier New"/>
+                <w:color w:val="C00000"/>
+                <w:sz w:val="19"/>
+              </w:rPr>
+              <w:t>start_command</w:t>
+            </w:r>
+            <w:r>
+              <w:rPr>
+                <w:sz w:val="19"/>
+              </w:rPr>
+              <w:t xml:space="preserve"> con </w:t>
+            </w:r>
+            <w:r>
+              <w:rPr>
+                <w:rFonts w:ascii="Courier New" w:hAnsi="Courier New"/>
+                <w:color w:val="C00000"/>
+                <w:sz w:val="19"/>
+              </w:rPr>
+              <w:t>ifconfig eth0 172.20.0.20 ...</w:t>
+            </w:r>
+          </w:p>
+        </w:tc>
+        <w:tc>
+          <w:tcPr>
+            <w:tcW w:type="dxa" w:w="3135"/>
+            <w:shd w:val="clear" w:color="auto" w:fill="E9EFF8"/>
+          </w:tcPr>
+          <w:p>
+            <w:r>
+              <w:rPr>
+                <w:sz w:val="19"/>
+              </w:rPr>
+            </w:r>
+            <w:r>
+              <w:rPr>
+                <w:sz w:val="19"/>
+              </w:rPr>
+              <w:t xml:space="preserve">Imagen 3rd-party sin entrypoint propio; sí tiene </w:t>
+            </w:r>
+            <w:r>
+              <w:rPr>
+                <w:rFonts w:ascii="Courier New" w:hAnsi="Courier New"/>
+                <w:color w:val="C00000"/>
+                <w:sz w:val="19"/>
+              </w:rPr>
+              <w:t>ifconfig</w:t>
+            </w:r>
+          </w:p>
+        </w:tc>
+      </w:tr>
+      <w:tr>
+        <w:tc>
+          <w:tcPr>
+            <w:tcW w:type="dxa" w:w="3135"/>
+          </w:tcPr>
+          <w:p>
+            <w:r>
+              <w:rPr>
+                <w:sz w:val="19"/>
+              </w:rPr>
+            </w:r>
+            <w:r>
+              <w:rPr>
+                <w:sz w:val="19"/>
+              </w:rPr>
+              <w:t>Ubuntu clients</w:t>
+            </w:r>
+          </w:p>
+        </w:tc>
+        <w:tc>
+          <w:tcPr>
+            <w:tcW w:type="dxa" w:w="3135"/>
+          </w:tcPr>
+          <w:p>
+            <w:r>
+              <w:rPr>
+                <w:sz w:val="19"/>
+              </w:rPr>
+            </w:r>
+            <w:r>
+              <w:rPr>
+                <w:sz w:val="19"/>
+              </w:rPr>
+              <w:t xml:space="preserve">Imagen nueva </w:t>
+            </w:r>
+            <w:r>
+              <w:rPr>
+                <w:rFonts w:ascii="Courier New" w:hAnsi="Courier New"/>
+                <w:color w:val="C00000"/>
+                <w:sz w:val="19"/>
+              </w:rPr>
+              <w:t>redteam/client</w:t>
+            </w:r>
+            <w:r>
+              <w:rPr>
+                <w:sz w:val="19"/>
+              </w:rPr>
+              <w:t xml:space="preserve"> (ver §11.4)</w:t>
+            </w:r>
+          </w:p>
+        </w:tc>
+        <w:tc>
+          <w:tcPr>
+            <w:tcW w:type="dxa" w:w="3135"/>
+          </w:tcPr>
+          <w:p>
+            <w:r>
+              <w:rPr>
+                <w:sz w:val="19"/>
+              </w:rPr>
+            </w:r>
+            <w:r>
+              <w:rPr>
+                <w:rFonts w:ascii="Courier New" w:hAnsi="Courier New"/>
+                <w:color w:val="C00000"/>
+                <w:sz w:val="19"/>
+              </w:rPr>
+              <w:t>ubuntu:22.04</w:t>
+            </w:r>
+            <w:r>
+              <w:rPr>
+                <w:sz w:val="19"/>
+              </w:rPr>
+              <w:t xml:space="preserve"> puro no trae </w:t>
+            </w:r>
+            <w:r>
+              <w:rPr>
+                <w:rFonts w:ascii="Courier New" w:hAnsi="Courier New"/>
+                <w:color w:val="C00000"/>
+                <w:sz w:val="19"/>
+              </w:rPr>
+              <w:t>ip</w:t>
+            </w:r>
+            <w:r>
+              <w:rPr>
+                <w:sz w:val="19"/>
+              </w:rPr>
+              <w:t xml:space="preserve"> ni </w:t>
+            </w:r>
+            <w:r>
+              <w:rPr>
+                <w:rFonts w:ascii="Courier New" w:hAnsi="Courier New"/>
+                <w:color w:val="C00000"/>
+                <w:sz w:val="19"/>
+              </w:rPr>
+              <w:t>ifconfig</w:t>
+            </w:r>
+          </w:p>
+        </w:tc>
+      </w:tr>
+    </w:tbl>
+    <w:p/>
+    <w:p>
+      <w:pPr>
+        <w:pStyle w:val="Heading2"/>
+        <w:spacing w:before="200" w:after="40"/>
+      </w:pPr>
+      <w:r>
+        <w:rPr>
+          <w:rFonts w:ascii="Calibri" w:hAnsi="Calibri"/>
+          <w:b/>
+          <w:color w:val="1F3564"/>
+          <w:sz w:val="24"/>
+        </w:rPr>
+        <w:t>11.4 Nueva imagen `redteam/client` para los Ubuntu</w:t>
+      </w:r>
+    </w:p>
+    <w:p>
+      <w:pPr>
+        <w:spacing w:before="40" w:after="80"/>
+      </w:pPr>
+      <w:r>
+        <w:rPr>
+          <w:b/>
+          <w:sz w:val="21"/>
+        </w:rPr>
+        <w:t>Problema:</w:t>
+      </w:r>
+      <w:r>
+        <w:rPr>
+          <w:sz w:val="21"/>
+        </w:rPr>
+        <w:t xml:space="preserve"> </w:t>
+      </w:r>
+      <w:r>
+        <w:rPr>
+          <w:rFonts w:ascii="Courier New" w:hAnsi="Courier New"/>
+          <w:color w:val="C00000"/>
+          <w:sz w:val="21"/>
+        </w:rPr>
+        <w:t>ubuntu:22.04</w:t>
+      </w:r>
+      <w:r>
+        <w:rPr>
+          <w:sz w:val="21"/>
+        </w:rPr>
+        <w:t xml:space="preserve"> puro </w:t>
+      </w:r>
+      <w:r>
+        <w:rPr>
+          <w:b/>
+          <w:sz w:val="21"/>
+        </w:rPr>
+        <w:t>no incluye `iproute2` ni `ifconfig`</w:t>
+      </w:r>
+      <w:r>
+        <w:rPr>
+          <w:sz w:val="21"/>
+        </w:rPr>
+        <w:t xml:space="preserve">, y la red del lab está </w:t>
+      </w:r>
+      <w:r>
+        <w:rPr>
+          <w:b/>
+          <w:sz w:val="21"/>
+        </w:rPr>
+        <w:t>aislada sin internet</w:t>
+      </w:r>
+      <w:r>
+        <w:rPr>
+          <w:sz w:val="21"/>
+        </w:rPr>
+        <w:t xml:space="preserve">, por lo que no se puede </w:t>
+      </w:r>
+      <w:r>
+        <w:rPr>
+          <w:rFonts w:ascii="Courier New" w:hAnsi="Courier New"/>
+          <w:color w:val="C00000"/>
+          <w:sz w:val="21"/>
+        </w:rPr>
+        <w:t>apt install</w:t>
+      </w:r>
+      <w:r>
+        <w:rPr>
+          <w:sz w:val="21"/>
+        </w:rPr>
+        <w:t xml:space="preserve"> en caliente dentro del contenedor. Sin esas herramientas, los clientes no pueden auto-configurar su IP.</w:t>
+      </w:r>
+    </w:p>
+    <w:p>
+      <w:pPr>
+        <w:spacing w:before="40" w:after="80"/>
+      </w:pPr>
+      <w:r>
+        <w:rPr>
+          <w:b/>
+          <w:sz w:val="21"/>
+        </w:rPr>
+        <w:t>Decisión:</w:t>
+      </w:r>
+      <w:r>
+        <w:rPr>
+          <w:sz w:val="21"/>
+        </w:rPr>
+        <w:t xml:space="preserve"> crear </w:t>
+      </w:r>
+      <w:r>
+        <w:rPr>
+          <w:rFonts w:ascii="Courier New" w:hAnsi="Courier New"/>
+          <w:color w:val="C00000"/>
+          <w:sz w:val="21"/>
+        </w:rPr>
+        <w:t>docker/client/Dockerfile</w:t>
+      </w:r>
+      <w:r>
+        <w:rPr>
+          <w:sz w:val="21"/>
+        </w:rPr>
+        <w:t xml:space="preserve"> — imagen basada en </w:t>
+      </w:r>
+      <w:r>
+        <w:rPr>
+          <w:rFonts w:ascii="Courier New" w:hAnsi="Courier New"/>
+          <w:color w:val="C00000"/>
+          <w:sz w:val="21"/>
+        </w:rPr>
+        <w:t>ubuntu:22.04</w:t>
+      </w:r>
+      <w:r>
+        <w:rPr>
+          <w:sz w:val="21"/>
+        </w:rPr>
+        <w:t xml:space="preserve"> con </w:t>
+      </w:r>
+      <w:r>
+        <w:rPr>
+          <w:rFonts w:ascii="Courier New" w:hAnsi="Courier New"/>
+          <w:color w:val="C00000"/>
+          <w:sz w:val="21"/>
+        </w:rPr>
+        <w:t>iproute2</w:t>
+      </w:r>
+      <w:r>
+        <w:rPr>
+          <w:sz w:val="21"/>
+        </w:rPr>
+        <w:t xml:space="preserve">, </w:t>
+      </w:r>
+      <w:r>
+        <w:rPr>
+          <w:rFonts w:ascii="Courier New" w:hAnsi="Courier New"/>
+          <w:color w:val="C00000"/>
+          <w:sz w:val="21"/>
+        </w:rPr>
+        <w:t>iputils-ping</w:t>
+      </w:r>
+      <w:r>
+        <w:rPr>
+          <w:sz w:val="21"/>
+        </w:rPr>
+        <w:t xml:space="preserve">, </w:t>
+      </w:r>
+      <w:r>
+        <w:rPr>
+          <w:rFonts w:ascii="Courier New" w:hAnsi="Courier New"/>
+          <w:color w:val="C00000"/>
+          <w:sz w:val="21"/>
+        </w:rPr>
+        <w:t>curl</w:t>
+      </w:r>
+      <w:r>
+        <w:rPr>
+          <w:sz w:val="21"/>
+        </w:rPr>
+        <w:t xml:space="preserve">, </w:t>
+      </w:r>
+      <w:r>
+        <w:rPr>
+          <w:rFonts w:ascii="Courier New" w:hAnsi="Courier New"/>
+          <w:color w:val="C00000"/>
+          <w:sz w:val="21"/>
+        </w:rPr>
+        <w:t>netcat-openbsd</w:t>
+      </w:r>
+      <w:r>
+        <w:rPr>
+          <w:sz w:val="21"/>
+        </w:rPr>
+        <w:t xml:space="preserve"> y el mismo entrypoint </w:t>
+      </w:r>
+      <w:r>
+        <w:rPr>
+          <w:rFonts w:ascii="Courier New" w:hAnsi="Courier New"/>
+          <w:color w:val="C00000"/>
+          <w:sz w:val="21"/>
+        </w:rPr>
+        <w:t>CONTAINER_IP</w:t>
+      </w:r>
+      <w:r>
+        <w:rPr>
+          <w:sz w:val="21"/>
+        </w:rPr>
+        <w:t xml:space="preserve"> que el Kali. Los nodos Ubuntu-Client-1/2 usan </w:t>
+      </w:r>
+      <w:r>
+        <w:rPr>
+          <w:rFonts w:ascii="Courier New" w:hAnsi="Courier New"/>
+          <w:color w:val="C00000"/>
+          <w:sz w:val="21"/>
+        </w:rPr>
+        <w:t>redteam/client:latest</w:t>
+      </w:r>
+      <w:r>
+        <w:rPr>
+          <w:sz w:val="21"/>
+        </w:rPr>
+        <w:t xml:space="preserve"> en lugar de </w:t>
+      </w:r>
+      <w:r>
+        <w:rPr>
+          <w:rFonts w:ascii="Courier New" w:hAnsi="Courier New"/>
+          <w:color w:val="C00000"/>
+          <w:sz w:val="21"/>
+        </w:rPr>
+        <w:t>ubuntu:22.04</w:t>
+      </w:r>
+      <w:r>
+        <w:rPr>
+          <w:sz w:val="21"/>
+        </w:rPr>
+        <w:t>.</w:t>
+      </w:r>
+    </w:p>
+    <w:p>
+      <w:pPr>
+        <w:spacing w:before="40" w:after="80"/>
+      </w:pPr>
+      <w:r>
+        <w:rPr>
+          <w:b/>
+          <w:sz w:val="21"/>
+        </w:rPr>
+        <w:t>Nota:</w:t>
+      </w:r>
+      <w:r>
+        <w:rPr>
+          <w:sz w:val="21"/>
+        </w:rPr>
+        <w:t xml:space="preserve"> en Docker Compose (master) los clientes siguen usando </w:t>
+      </w:r>
+      <w:r>
+        <w:rPr>
+          <w:rFonts w:ascii="Courier New" w:hAnsi="Courier New"/>
+          <w:color w:val="C00000"/>
+          <w:sz w:val="21"/>
+        </w:rPr>
+        <w:t>ubuntu:22.04</w:t>
+      </w:r>
+      <w:r>
+        <w:rPr>
+          <w:sz w:val="21"/>
+        </w:rPr>
+        <w:t xml:space="preserve"> sin problema, porque ahí Docker asigna la IP automáticamente (no se necesitan net tools dentro del contenedor). El cambio a </w:t>
+      </w:r>
+      <w:r>
+        <w:rPr>
+          <w:rFonts w:ascii="Courier New" w:hAnsi="Courier New"/>
+          <w:color w:val="C00000"/>
+          <w:sz w:val="21"/>
+        </w:rPr>
+        <w:t>redteam/client</w:t>
+      </w:r>
+      <w:r>
+        <w:rPr>
+          <w:sz w:val="21"/>
+        </w:rPr>
+        <w:t xml:space="preserve"> aplica </w:t>
+      </w:r>
+      <w:r>
+        <w:rPr>
+          <w:b/>
+          <w:sz w:val="21"/>
+        </w:rPr>
+        <w:t>solo a GNS3</w:t>
+      </w:r>
+      <w:r>
+        <w:rPr>
+          <w:sz w:val="21"/>
+        </w:rPr>
+        <w:t>.</w:t>
+      </w:r>
+    </w:p>
+    <w:p>
+      <w:pPr>
+        <w:pStyle w:val="Heading2"/>
+        <w:spacing w:before="200" w:after="40"/>
+      </w:pPr>
+      <w:r>
+        <w:rPr>
+          <w:rFonts w:ascii="Calibri" w:hAnsi="Calibri"/>
+          <w:b/>
+          <w:color w:val="1F3564"/>
+          <w:sz w:val="24"/>
+        </w:rPr>
+        <w:t>11.5 Automatización vía API REST de GNS3</w:t>
+      </w:r>
+    </w:p>
+    <w:p>
+      <w:pPr>
+        <w:spacing w:before="40" w:after="80"/>
+      </w:pPr>
+      <w:r>
+        <w:rPr>
+          <w:b/>
+          <w:sz w:val="21"/>
+        </w:rPr>
+        <w:t>Decisión:</w:t>
+      </w:r>
+      <w:r>
+        <w:rPr>
+          <w:sz w:val="21"/>
+        </w:rPr>
+        <w:t xml:space="preserve"> en lugar de crear templates y topología manualmente en la GUI, se automatizó todo vía la </w:t>
+      </w:r>
+      <w:r>
+        <w:rPr>
+          <w:b/>
+          <w:sz w:val="21"/>
+        </w:rPr>
+        <w:t>API REST de GNS3</w:t>
+      </w:r>
+      <w:r>
+        <w:rPr>
+          <w:sz w:val="21"/>
+        </w:rPr>
+        <w:t xml:space="preserve"> (</w:t>
+      </w:r>
+      <w:r>
+        <w:rPr>
+          <w:rFonts w:ascii="Courier New" w:hAnsi="Courier New"/>
+          <w:color w:val="C00000"/>
+          <w:sz w:val="21"/>
+        </w:rPr>
+        <w:t>http://192.168.116.128/v2</w:t>
+      </w:r>
+      <w:r>
+        <w:rPr>
+          <w:sz w:val="21"/>
+        </w:rPr>
+        <w:t xml:space="preserve">, puerto 80, sin autenticación). Esto incluye: creación de los 7 templates Docker, instanciación de los 8 nodos + switch de 16 puertos, creación de los 8 enlaces, y arranque de la topología. Los IDs resultantes se guardan en </w:t>
+      </w:r>
+      <w:r>
+        <w:rPr>
+          <w:rFonts w:ascii="Courier New" w:hAnsi="Courier New"/>
+          <w:color w:val="C00000"/>
+          <w:sz w:val="21"/>
+        </w:rPr>
+        <w:t>gns3/topology-state.json</w:t>
+      </w:r>
+      <w:r>
+        <w:rPr>
+          <w:sz w:val="21"/>
+        </w:rPr>
+        <w:t>.</w:t>
+      </w:r>
+    </w:p>
+    <w:p>
+      <w:pPr>
+        <w:spacing w:before="40" w:after="80"/>
+      </w:pPr>
+      <w:r>
+        <w:rPr>
+          <w:b/>
+          <w:sz w:val="21"/>
+        </w:rPr>
+        <w:t>Beneficio:</w:t>
+      </w:r>
+      <w:r>
+        <w:rPr>
+          <w:sz w:val="21"/>
+        </w:rPr>
+        <w:t xml:space="preserve"> la topología es reproducible por script y no depende de arrastrar nodos a mano en la GUI.</w:t>
+      </w:r>
+    </w:p>
+    <w:p>
+      <w:pPr>
+        <w:pStyle w:val="Heading2"/>
+        <w:spacing w:before="200" w:after="40"/>
+      </w:pPr>
+      <w:r>
+        <w:rPr>
+          <w:rFonts w:ascii="Calibri" w:hAnsi="Calibri"/>
+          <w:b/>
+          <w:color w:val="1F3564"/>
+          <w:sz w:val="24"/>
+        </w:rPr>
+        <w:t>11.6 Resumen de archivos nuevos/modificados en esta fase</w:t>
+      </w:r>
+    </w:p>
+    <w:p>
+      <w:pPr>
+        <w:spacing w:before="0" w:after="0"/>
+        <w:ind w:left="283"/>
+        <w:shd w:val="clear" w:color="auto" w:fill="F2F2F2"/>
+      </w:pPr>
+      <w:r>
+        <w:rPr>
+          <w:rFonts w:ascii="Courier New" w:hAnsi="Courier New"/>
+          <w:color w:val="1A1A1A"/>
+          <w:sz w:val="17"/>
+        </w:rPr>
+        <w:t>docker/client/Dockerfile              [NUEVO   — cliente Ubuntu con net tools]</w:t>
+      </w:r>
+    </w:p>
+    <w:p>
+      <w:pPr>
+        <w:spacing w:before="0" w:after="0"/>
+        <w:ind w:left="283"/>
+        <w:shd w:val="clear" w:color="auto" w:fill="F2F2F2"/>
+      </w:pPr>
+      <w:r>
+        <w:rPr>
+          <w:rFonts w:ascii="Courier New" w:hAnsi="Courier New"/>
+          <w:color w:val="1A1A1A"/>
+          <w:sz w:val="17"/>
+        </w:rPr>
+        <w:t>docker/blue-team/bt-mail/main.cf      [MODIFICADO — fix open relay Postfix]</w:t>
+      </w:r>
+    </w:p>
+    <w:p>
+      <w:pPr>
+        <w:spacing w:before="0" w:after="0"/>
+        <w:ind w:left="283"/>
+        <w:shd w:val="clear" w:color="auto" w:fill="F2F2F2"/>
+      </w:pPr>
+      <w:r>
+        <w:rPr>
+          <w:rFonts w:ascii="Courier New" w:hAnsi="Courier New"/>
+          <w:color w:val="1A1A1A"/>
+          <w:sz w:val="17"/>
+        </w:rPr>
+        <w:t>gns3/verify-sweep.sh                  [NUEVO   — verificación end-to-end desde Kali]</w:t>
+      </w:r>
+    </w:p>
+    <w:p>
+      <w:pPr>
+        <w:spacing w:before="0" w:after="0"/>
+        <w:ind w:left="283"/>
+        <w:shd w:val="clear" w:color="auto" w:fill="F2F2F2"/>
+      </w:pPr>
+      <w:r>
+        <w:rPr>
+          <w:rFonts w:ascii="Courier New" w:hAnsi="Courier New"/>
+          <w:color w:val="1A1A1A"/>
+          <w:sz w:val="17"/>
+        </w:rPr>
+        <w:t>gns3/topology-state.json              [NUEVO   — IDs de proyecto/nodos GNS3]</w:t>
+      </w:r>
+    </w:p>
+    <w:p>
+      <w:pPr>
+        <w:spacing w:before="0" w:after="80"/>
+      </w:pPr>
+    </w:p>
+    <w:p>
+      <w:pPr>
+        <w:pStyle w:val="Heading2"/>
+        <w:spacing w:before="200" w:after="40"/>
+      </w:pPr>
+      <w:r>
+        <w:rPr>
+          <w:rFonts w:ascii="Calibri" w:hAnsi="Calibri"/>
+          <w:b/>
+          <w:color w:val="1F3564"/>
+          <w:sz w:val="24"/>
+        </w:rPr>
+        <w:t>11.7 Estado de verificación final (2026-05-29)</w:t>
+      </w:r>
+    </w:p>
+    <w:tbl>
+      <w:tblPr>
+        <w:tblStyle w:val="TableGrid"/>
+        <w:tblW w:type="auto" w:w="0"/>
+        <w:jc w:val="left"/>
+        <w:tblLook w:firstColumn="1" w:firstRow="1" w:lastColumn="0" w:lastRow="0" w:noHBand="0" w:noVBand="1" w:val="04A0"/>
+      </w:tblPr>
+      <w:tblGrid>
+        <w:gridCol w:w="3135"/>
+        <w:gridCol w:w="3135"/>
+        <w:gridCol w:w="3135"/>
+      </w:tblGrid>
+      <w:tr>
+        <w:tc>
+          <w:tcPr>
+            <w:tcW w:type="dxa" w:w="3135"/>
+            <w:shd w:val="clear" w:color="auto" w:fill="1F3564"/>
+          </w:tcPr>
+          <w:p>
+            <w:r>
+              <w:rPr>
+                <w:b/>
+                <w:color w:val="FFFFFF"/>
+                <w:sz w:val="19"/>
+              </w:rPr>
+            </w:r>
+            <w:r>
+              <w:rPr>
+                <w:b/>
+                <w:color w:val="FFFFFF"/>
+                <w:sz w:val="19"/>
+              </w:rPr>
+              <w:t>Nodo</w:t>
+            </w:r>
+          </w:p>
+        </w:tc>
+        <w:tc>
+          <w:tcPr>
+            <w:tcW w:type="dxa" w:w="3135"/>
+            <w:shd w:val="clear" w:color="auto" w:fill="1F3564"/>
+          </w:tcPr>
+          <w:p>
+            <w:r>
+              <w:rPr>
+                <w:b/>
+                <w:color w:val="FFFFFF"/>
+                <w:sz w:val="19"/>
+              </w:rPr>
+            </w:r>
+            <w:r>
+              <w:rPr>
+                <w:b/>
+                <w:color w:val="FFFFFF"/>
+                <w:sz w:val="19"/>
+              </w:rPr>
+              <w:t>IP</w:t>
+            </w:r>
+          </w:p>
+        </w:tc>
+        <w:tc>
+          <w:tcPr>
+            <w:tcW w:type="dxa" w:w="3135"/>
+            <w:shd w:val="clear" w:color="auto" w:fill="1F3564"/>
+          </w:tcPr>
+          <w:p>
+            <w:r>
+              <w:rPr>
+                <w:b/>
+                <w:color w:val="FFFFFF"/>
+                <w:sz w:val="19"/>
+              </w:rPr>
+            </w:r>
+            <w:r>
+              <w:rPr>
+                <w:b/>
+                <w:color w:val="FFFFFF"/>
+                <w:sz w:val="19"/>
+              </w:rPr>
+              <w:t>Servicio verificado</w:t>
+            </w:r>
+          </w:p>
+        </w:tc>
+      </w:tr>
+      <w:tr>
+        <w:tc>
+          <w:tcPr>
+            <w:tcW w:type="dxa" w:w="3135"/>
+          </w:tcPr>
+          <w:p>
+            <w:r>
+              <w:rPr>
+                <w:sz w:val="19"/>
+              </w:rPr>
+            </w:r>
+            <w:r>
+              <w:rPr>
+                <w:sz w:val="19"/>
+              </w:rPr>
+              <w:t>Kali-Attacker</w:t>
+            </w:r>
+          </w:p>
+        </w:tc>
+        <w:tc>
+          <w:tcPr>
+            <w:tcW w:type="dxa" w:w="3135"/>
+          </w:tcPr>
+          <w:p>
+            <w:r>
+              <w:rPr>
+                <w:sz w:val="19"/>
+              </w:rPr>
+            </w:r>
+            <w:r>
+              <w:rPr>
+                <w:sz w:val="19"/>
+              </w:rPr>
+              <w:t>.10</w:t>
+            </w:r>
+          </w:p>
+        </w:tc>
+        <w:tc>
+          <w:tcPr>
+            <w:tcW w:type="dxa" w:w="3135"/>
+          </w:tcPr>
+          <w:p>
+            <w:r>
+              <w:rPr>
+                <w:sz w:val="19"/>
+              </w:rPr>
+            </w:r>
+            <w:r>
+              <w:rPr>
+                <w:sz w:val="19"/>
+              </w:rPr>
+              <w:t>IP auto-configurada, herramientas operativas</w:t>
+            </w:r>
+          </w:p>
+        </w:tc>
+      </w:tr>
+      <w:tr>
+        <w:tc>
+          <w:tcPr>
+            <w:tcW w:type="dxa" w:w="3135"/>
+            <w:shd w:val="clear" w:color="auto" w:fill="E9EFF8"/>
+          </w:tcPr>
+          <w:p>
+            <w:r>
+              <w:rPr>
+                <w:sz w:val="19"/>
+              </w:rPr>
+            </w:r>
+            <w:r>
+              <w:rPr>
+                <w:sz w:val="19"/>
+              </w:rPr>
+              <w:t>Metasploitable2</w:t>
+            </w:r>
+          </w:p>
+        </w:tc>
+        <w:tc>
+          <w:tcPr>
+            <w:tcW w:type="dxa" w:w="3135"/>
+            <w:shd w:val="clear" w:color="auto" w:fill="E9EFF8"/>
+          </w:tcPr>
+          <w:p>
+            <w:r>
+              <w:rPr>
+                <w:sz w:val="19"/>
+              </w:rPr>
+            </w:r>
+            <w:r>
+              <w:rPr>
+                <w:sz w:val="19"/>
+              </w:rPr>
+              <w:t>.20</w:t>
+            </w:r>
+          </w:p>
+        </w:tc>
+        <w:tc>
+          <w:tcPr>
+            <w:tcW w:type="dxa" w:w="3135"/>
+            <w:shd w:val="clear" w:color="auto" w:fill="E9EFF8"/>
+          </w:tcPr>
+          <w:p>
+            <w:r>
+              <w:rPr>
+                <w:sz w:val="19"/>
+              </w:rPr>
+            </w:r>
+            <w:r>
+              <w:rPr>
+                <w:sz w:val="19"/>
+              </w:rPr>
+              <w:t>Puertos 21, 22, 23, 80, 445 abiertos</w:t>
+            </w:r>
+          </w:p>
+        </w:tc>
+      </w:tr>
+      <w:tr>
+        <w:tc>
+          <w:tcPr>
+            <w:tcW w:type="dxa" w:w="3135"/>
+          </w:tcPr>
+          <w:p>
+            <w:r>
+              <w:rPr>
+                <w:sz w:val="19"/>
+              </w:rPr>
+            </w:r>
+            <w:r>
+              <w:rPr>
+                <w:sz w:val="19"/>
+              </w:rPr>
+              <w:t>Ubuntu-Client-1/2</w:t>
+            </w:r>
+          </w:p>
+        </w:tc>
+        <w:tc>
+          <w:tcPr>
+            <w:tcW w:type="dxa" w:w="3135"/>
+          </w:tcPr>
+          <w:p>
+            <w:r>
+              <w:rPr>
+                <w:sz w:val="19"/>
+              </w:rPr>
+            </w:r>
+            <w:r>
+              <w:rPr>
+                <w:sz w:val="19"/>
+              </w:rPr>
+              <w:t>.30/.31</w:t>
+            </w:r>
+          </w:p>
+        </w:tc>
+        <w:tc>
+          <w:tcPr>
+            <w:tcW w:type="dxa" w:w="3135"/>
+          </w:tcPr>
+          <w:p>
+            <w:r>
+              <w:rPr>
+                <w:sz w:val="19"/>
+              </w:rPr>
+            </w:r>
+            <w:r>
+              <w:rPr>
+                <w:sz w:val="19"/>
+              </w:rPr>
+              <w:t>UP (responden a ping)</w:t>
+            </w:r>
+          </w:p>
+        </w:tc>
+      </w:tr>
+      <w:tr>
+        <w:tc>
+          <w:tcPr>
+            <w:tcW w:type="dxa" w:w="3135"/>
+            <w:shd w:val="clear" w:color="auto" w:fill="E9EFF8"/>
+          </w:tcPr>
+          <w:p>
+            <w:r>
+              <w:rPr>
+                <w:sz w:val="19"/>
+              </w:rPr>
+            </w:r>
+            <w:r>
+              <w:rPr>
+                <w:sz w:val="19"/>
+              </w:rPr>
+              <w:t>bt-web</w:t>
+            </w:r>
+          </w:p>
+        </w:tc>
+        <w:tc>
+          <w:tcPr>
+            <w:tcW w:type="dxa" w:w="3135"/>
+            <w:shd w:val="clear" w:color="auto" w:fill="E9EFF8"/>
+          </w:tcPr>
+          <w:p>
+            <w:r>
+              <w:rPr>
+                <w:sz w:val="19"/>
+              </w:rPr>
+            </w:r>
+            <w:r>
+              <w:rPr>
+                <w:sz w:val="19"/>
+              </w:rPr>
+              <w:t>.50</w:t>
+            </w:r>
+          </w:p>
+        </w:tc>
+        <w:tc>
+          <w:tcPr>
+            <w:tcW w:type="dxa" w:w="3135"/>
+            <w:shd w:val="clear" w:color="auto" w:fill="E9EFF8"/>
+          </w:tcPr>
+          <w:p>
+            <w:r>
+              <w:rPr>
+                <w:sz w:val="19"/>
+              </w:rPr>
+            </w:r>
+            <w:r>
+              <w:rPr>
+                <w:sz w:val="19"/>
+              </w:rPr>
+              <w:t>HTTP 200</w:t>
+            </w:r>
+          </w:p>
+        </w:tc>
+      </w:tr>
+      <w:tr>
+        <w:tc>
+          <w:tcPr>
+            <w:tcW w:type="dxa" w:w="3135"/>
+          </w:tcPr>
+          <w:p>
+            <w:r>
+              <w:rPr>
+                <w:sz w:val="19"/>
+              </w:rPr>
+            </w:r>
+            <w:r>
+              <w:rPr>
+                <w:sz w:val="19"/>
+              </w:rPr>
+              <w:t>bt-dns</w:t>
+            </w:r>
+          </w:p>
+        </w:tc>
+        <w:tc>
+          <w:tcPr>
+            <w:tcW w:type="dxa" w:w="3135"/>
+          </w:tcPr>
+          <w:p>
+            <w:r>
+              <w:rPr>
+                <w:sz w:val="19"/>
+              </w:rPr>
+            </w:r>
+            <w:r>
+              <w:rPr>
+                <w:sz w:val="19"/>
+              </w:rPr>
+              <w:t>.51</w:t>
+            </w:r>
+          </w:p>
+        </w:tc>
+        <w:tc>
+          <w:tcPr>
+            <w:tcW w:type="dxa" w:w="3135"/>
+          </w:tcPr>
+          <w:p>
+            <w:r>
+              <w:rPr>
+                <w:sz w:val="19"/>
+              </w:rPr>
+            </w:r>
+            <w:r>
+              <w:rPr>
+                <w:sz w:val="19"/>
+              </w:rPr>
+              <w:t xml:space="preserve">Resuelve </w:t>
+            </w:r>
+            <w:r>
+              <w:rPr>
+                <w:rFonts w:ascii="Courier New" w:hAnsi="Courier New"/>
+                <w:color w:val="C00000"/>
+                <w:sz w:val="19"/>
+              </w:rPr>
+              <w:t>lab.local</w:t>
+            </w:r>
+            <w:r>
+              <w:rPr>
+                <w:sz w:val="19"/>
+              </w:rPr>
+              <w:t xml:space="preserve"> (NOERROR, registros A)</w:t>
+            </w:r>
+          </w:p>
+        </w:tc>
+      </w:tr>
+      <w:tr>
+        <w:tc>
+          <w:tcPr>
+            <w:tcW w:type="dxa" w:w="3135"/>
+            <w:shd w:val="clear" w:color="auto" w:fill="E9EFF8"/>
+          </w:tcPr>
+          <w:p>
+            <w:r>
+              <w:rPr>
+                <w:sz w:val="19"/>
+              </w:rPr>
+            </w:r>
+            <w:r>
+              <w:rPr>
+                <w:sz w:val="19"/>
+              </w:rPr>
+              <w:t>bt-smb</w:t>
+            </w:r>
+          </w:p>
+        </w:tc>
+        <w:tc>
+          <w:tcPr>
+            <w:tcW w:type="dxa" w:w="3135"/>
+            <w:shd w:val="clear" w:color="auto" w:fill="E9EFF8"/>
+          </w:tcPr>
+          <w:p>
+            <w:r>
+              <w:rPr>
+                <w:sz w:val="19"/>
+              </w:rPr>
+            </w:r>
+            <w:r>
+              <w:rPr>
+                <w:sz w:val="19"/>
+              </w:rPr>
+              <w:t>.52</w:t>
+            </w:r>
+          </w:p>
+        </w:tc>
+        <w:tc>
+          <w:tcPr>
+            <w:tcW w:type="dxa" w:w="3135"/>
+            <w:shd w:val="clear" w:color="auto" w:fill="E9EFF8"/>
+          </w:tcPr>
+          <w:p>
+            <w:r>
+              <w:rPr>
+                <w:sz w:val="19"/>
+              </w:rPr>
+            </w:r>
+            <w:r>
+              <w:rPr>
+                <w:sz w:val="19"/>
+              </w:rPr>
+              <w:t xml:space="preserve">Shares </w:t>
+            </w:r>
+            <w:r>
+              <w:rPr>
+                <w:rFonts w:ascii="Courier New" w:hAnsi="Courier New"/>
+                <w:color w:val="C00000"/>
+                <w:sz w:val="19"/>
+              </w:rPr>
+              <w:t>public</w:t>
+            </w:r>
+            <w:r>
+              <w:rPr>
+                <w:sz w:val="19"/>
+              </w:rPr>
+              <w:t xml:space="preserve"> y </w:t>
+            </w:r>
+            <w:r>
+              <w:rPr>
+                <w:rFonts w:ascii="Courier New" w:hAnsi="Courier New"/>
+                <w:color w:val="C00000"/>
+                <w:sz w:val="19"/>
+              </w:rPr>
+              <w:t>private</w:t>
+            </w:r>
+            <w:r>
+              <w:rPr>
+                <w:sz w:val="19"/>
+              </w:rPr>
+              <w:t xml:space="preserve"> visibles sin auth</w:t>
+            </w:r>
+          </w:p>
+        </w:tc>
+      </w:tr>
+      <w:tr>
+        <w:tc>
+          <w:tcPr>
+            <w:tcW w:type="dxa" w:w="3135"/>
+          </w:tcPr>
+          <w:p>
+            <w:r>
+              <w:rPr>
+                <w:sz w:val="19"/>
+              </w:rPr>
+            </w:r>
+            <w:r>
+              <w:rPr>
+                <w:sz w:val="19"/>
+              </w:rPr>
+              <w:t>bt-mail</w:t>
+            </w:r>
+          </w:p>
+        </w:tc>
+        <w:tc>
+          <w:tcPr>
+            <w:tcW w:type="dxa" w:w="3135"/>
+          </w:tcPr>
+          <w:p>
+            <w:r>
+              <w:rPr>
+                <w:sz w:val="19"/>
+              </w:rPr>
+            </w:r>
+            <w:r>
+              <w:rPr>
+                <w:sz w:val="19"/>
+              </w:rPr>
+              <w:t>.53</w:t>
+            </w:r>
+          </w:p>
+        </w:tc>
+        <w:tc>
+          <w:tcPr>
+            <w:tcW w:type="dxa" w:w="3135"/>
+          </w:tcPr>
+          <w:p>
+            <w:r>
+              <w:rPr>
+                <w:sz w:val="19"/>
+              </w:rPr>
+            </w:r>
+            <w:r>
+              <w:rPr>
+                <w:sz w:val="19"/>
+              </w:rPr>
+              <w:t xml:space="preserve">Banner SMTP </w:t>
+            </w:r>
+            <w:r>
+              <w:rPr>
+                <w:rFonts w:ascii="Courier New" w:hAnsi="Courier New"/>
+                <w:color w:val="C00000"/>
+                <w:sz w:val="19"/>
+              </w:rPr>
+              <w:t>220 bt-mail.lab.local ESMTP Postfix</w:t>
+            </w:r>
+          </w:p>
+        </w:tc>
+      </w:tr>
+    </w:tbl>
+    <w:p/>
+    <w:p>
+      <w:pPr>
+        <w:spacing w:before="40" w:after="80"/>
+      </w:pPr>
+      <w:r>
+        <w:rPr>
+          <w:b/>
+          <w:sz w:val="21"/>
+        </w:rPr>
+        <w:t>Todos los nodos responden. La topología está lista para la demostración.</w:t>
       </w:r>
     </w:p>
     <w:sectPr>

</xml_diff>